<commit_message>
DAT-012: TallyPrime Edit Log checked like for like; no edit history in the export; seed case and test
Co-Authored-By: Claude Opus 5.5 <noreply@anthropic.com>
</commit_message>
<xml_diff>
--- a/docs/export/project-history.docx
+++ b/docs/export/project-history.docx
@@ -28,7 +28,7 @@
         </w:p>
       </w:sdtContent>
     </w:sdt>
-    <w:bookmarkStart w:id="30" w:name="project-history"/>
+    <w:bookmarkStart w:id="31" w:name="project-history"/>
     <w:p>
       <w:pPr>
         <w:pStyle w:val="Heading1"/>
@@ -3104,7 +3104,7 @@
       </w:tr>
     </w:tbl>
     <w:bookmarkEnd w:id="25"/>
-    <w:bookmarkStart w:id="26" w:name="pilot-results-counts-only"/>
+    <w:bookmarkStart w:id="27" w:name="pilot-results-counts-only"/>
     <w:p>
       <w:pPr>
         <w:pStyle w:val="Heading2"/>
@@ -3207,8 +3207,41 @@
         <w:t xml:space="preserve">passes every check (104 as of 2026-10-02), with the stock-ledger and foreign-currency notes.</w:t>
       </w:r>
     </w:p>
+    <w:bookmarkStart w:id="26" w:name="tallyprime-edit-log-2026-10-19"/>
+    <w:p>
+      <w:pPr>
+        <w:pStyle w:val="Heading3"/>
+      </w:pPr>
+      <w:r>
+        <w:t xml:space="preserve">TallyPrime Edit Log (2026-10-19)</w:t>
+      </w:r>
+    </w:p>
+    <w:p>
+      <w:pPr>
+        <w:pStyle w:val="FirstParagraph"/>
+      </w:pPr>
+      <w:r>
+        <w:t xml:space="preserve">The test company was opened in TallyPrime Edit Log (migrated, same GUID). Every export the sync and validation use was identical to TallyPrime’s in fields, formats and values; an alteration leaves no edit history in the XML export, only a filled</w:t>
+      </w:r>
+      <w:r>
+        <w:t xml:space="preserve"> </w:t>
+      </w:r>
+      <w:r>
+        <w:rPr>
+          <w:rStyle w:val="VerbatimChar"/>
+        </w:rPr>
+        <w:t xml:space="preserve">UPDATEDDATETIME</w:t>
+      </w:r>
+      <w:r>
+        <w:t xml:space="preserve"> </w:t>
+      </w:r>
+      <w:r>
+        <w:t xml:space="preserve">(not fetched). Full sync, validation (105 checks) and the report passed with no code change. A first attempt opened an empty new company of the same name (a different GUID, with job work, cost centres and reversing journals off): nothing was written to it.</w:t>
+      </w:r>
+    </w:p>
     <w:bookmarkEnd w:id="26"/>
-    <w:bookmarkStart w:id="27" w:name="lessons-learned"/>
+    <w:bookmarkEnd w:id="27"/>
+    <w:bookmarkStart w:id="28" w:name="lessons-learned"/>
     <w:p>
       <w:pPr>
         <w:pStyle w:val="Heading2"/>
@@ -3370,8 +3403,8 @@
         <w:t xml:space="preserve">A request with an unknown function froze TallyPrime behind a dialog; only exported field and report names are used.</w:t>
       </w:r>
     </w:p>
-    <w:bookmarkEnd w:id="27"/>
-    <w:bookmarkStart w:id="28" w:name="open-items"/>
+    <w:bookmarkEnd w:id="28"/>
+    <w:bookmarkStart w:id="29" w:name="open-items"/>
     <w:p>
       <w:pPr>
         <w:pStyle w:val="Heading2"/>
@@ -3566,8 +3599,8 @@
         </w:tc>
       </w:tr>
     </w:tbl>
-    <w:bookmarkEnd w:id="28"/>
-    <w:bookmarkStart w:id="29" w:name="change-log"/>
+    <w:bookmarkEnd w:id="29"/>
+    <w:bookmarkStart w:id="30" w:name="change-log"/>
     <w:p>
       <w:pPr>
         <w:pStyle w:val="Heading2"/>
@@ -3633,6 +3666,41 @@
               <w:pStyle w:val="Compact"/>
             </w:pPr>
             <w:r>
+              <w:t xml:space="preserve">2026-10-19</w:t>
+            </w:r>
+          </w:p>
+        </w:tc>
+        <w:tc>
+          <w:tcPr/>
+          <w:p>
+            <w:pPr>
+              <w:pStyle w:val="Compact"/>
+            </w:pPr>
+            <w:r>
+              <w:t xml:space="preserve">1.1</w:t>
+            </w:r>
+          </w:p>
+        </w:tc>
+        <w:tc>
+          <w:tcPr/>
+          <w:p>
+            <w:pPr>
+              <w:pStyle w:val="Compact"/>
+            </w:pPr>
+            <w:r>
+              <w:t xml:space="preserve">TallyPrime Edit Log check.</w:t>
+            </w:r>
+          </w:p>
+        </w:tc>
+      </w:tr>
+      <w:tr>
+        <w:tc>
+          <w:tcPr/>
+          <w:p>
+            <w:pPr>
+              <w:pStyle w:val="Compact"/>
+            </w:pPr>
+            <w:r>
               <w:t xml:space="preserve">2026-10-16</w:t>
             </w:r>
           </w:p>
@@ -3661,8 +3729,8 @@
         </w:tc>
       </w:tr>
     </w:tbl>
-    <w:bookmarkEnd w:id="29"/>
     <w:bookmarkEnd w:id="30"/>
+    <w:bookmarkEnd w:id="31"/>
     <w:sectPr/>
   </w:body>
 </w:document>

</xml_diff>

<commit_message>
DAT-012: TallyPrime Edit Log checked like for like; no edit history in the export; seed case and test (#35)
Co-authored-by: Claude Opus 5.5 <noreply@anthropic.com>
</commit_message>
<xml_diff>
--- a/docs/export/project-history.docx
+++ b/docs/export/project-history.docx
@@ -28,7 +28,7 @@
         </w:p>
       </w:sdtContent>
     </w:sdt>
-    <w:bookmarkStart w:id="30" w:name="project-history"/>
+    <w:bookmarkStart w:id="31" w:name="project-history"/>
     <w:p>
       <w:pPr>
         <w:pStyle w:val="Heading1"/>
@@ -3104,7 +3104,7 @@
       </w:tr>
     </w:tbl>
     <w:bookmarkEnd w:id="25"/>
-    <w:bookmarkStart w:id="26" w:name="pilot-results-counts-only"/>
+    <w:bookmarkStart w:id="27" w:name="pilot-results-counts-only"/>
     <w:p>
       <w:pPr>
         <w:pStyle w:val="Heading2"/>
@@ -3207,8 +3207,41 @@
         <w:t xml:space="preserve">passes every check (104 as of 2026-10-02), with the stock-ledger and foreign-currency notes.</w:t>
       </w:r>
     </w:p>
+    <w:bookmarkStart w:id="26" w:name="tallyprime-edit-log-2026-10-19"/>
+    <w:p>
+      <w:pPr>
+        <w:pStyle w:val="Heading3"/>
+      </w:pPr>
+      <w:r>
+        <w:t xml:space="preserve">TallyPrime Edit Log (2026-10-19)</w:t>
+      </w:r>
+    </w:p>
+    <w:p>
+      <w:pPr>
+        <w:pStyle w:val="FirstParagraph"/>
+      </w:pPr>
+      <w:r>
+        <w:t xml:space="preserve">The test company was opened in TallyPrime Edit Log (migrated, same GUID). Every export the sync and validation use was identical to TallyPrime’s in fields, formats and values; an alteration leaves no edit history in the XML export, only a filled</w:t>
+      </w:r>
+      <w:r>
+        <w:t xml:space="preserve"> </w:t>
+      </w:r>
+      <w:r>
+        <w:rPr>
+          <w:rStyle w:val="VerbatimChar"/>
+        </w:rPr>
+        <w:t xml:space="preserve">UPDATEDDATETIME</w:t>
+      </w:r>
+      <w:r>
+        <w:t xml:space="preserve"> </w:t>
+      </w:r>
+      <w:r>
+        <w:t xml:space="preserve">(not fetched). Full sync, validation (105 checks) and the report passed with no code change. A first attempt opened an empty new company of the same name (a different GUID, with job work, cost centres and reversing journals off): nothing was written to it.</w:t>
+      </w:r>
+    </w:p>
     <w:bookmarkEnd w:id="26"/>
-    <w:bookmarkStart w:id="27" w:name="lessons-learned"/>
+    <w:bookmarkEnd w:id="27"/>
+    <w:bookmarkStart w:id="28" w:name="lessons-learned"/>
     <w:p>
       <w:pPr>
         <w:pStyle w:val="Heading2"/>
@@ -3370,8 +3403,8 @@
         <w:t xml:space="preserve">A request with an unknown function froze TallyPrime behind a dialog; only exported field and report names are used.</w:t>
       </w:r>
     </w:p>
-    <w:bookmarkEnd w:id="27"/>
-    <w:bookmarkStart w:id="28" w:name="open-items"/>
+    <w:bookmarkEnd w:id="28"/>
+    <w:bookmarkStart w:id="29" w:name="open-items"/>
     <w:p>
       <w:pPr>
         <w:pStyle w:val="Heading2"/>
@@ -3566,8 +3599,8 @@
         </w:tc>
       </w:tr>
     </w:tbl>
-    <w:bookmarkEnd w:id="28"/>
-    <w:bookmarkStart w:id="29" w:name="change-log"/>
+    <w:bookmarkEnd w:id="29"/>
+    <w:bookmarkStart w:id="30" w:name="change-log"/>
     <w:p>
       <w:pPr>
         <w:pStyle w:val="Heading2"/>
@@ -3633,6 +3666,41 @@
               <w:pStyle w:val="Compact"/>
             </w:pPr>
             <w:r>
+              <w:t xml:space="preserve">2026-10-19</w:t>
+            </w:r>
+          </w:p>
+        </w:tc>
+        <w:tc>
+          <w:tcPr/>
+          <w:p>
+            <w:pPr>
+              <w:pStyle w:val="Compact"/>
+            </w:pPr>
+            <w:r>
+              <w:t xml:space="preserve">1.1</w:t>
+            </w:r>
+          </w:p>
+        </w:tc>
+        <w:tc>
+          <w:tcPr/>
+          <w:p>
+            <w:pPr>
+              <w:pStyle w:val="Compact"/>
+            </w:pPr>
+            <w:r>
+              <w:t xml:space="preserve">TallyPrime Edit Log check.</w:t>
+            </w:r>
+          </w:p>
+        </w:tc>
+      </w:tr>
+      <w:tr>
+        <w:tc>
+          <w:tcPr/>
+          <w:p>
+            <w:pPr>
+              <w:pStyle w:val="Compact"/>
+            </w:pPr>
+            <w:r>
               <w:t xml:space="preserve">2026-10-16</w:t>
             </w:r>
           </w:p>
@@ -3661,8 +3729,8 @@
         </w:tc>
       </w:tr>
     </w:tbl>
-    <w:bookmarkEnd w:id="29"/>
     <w:bookmarkEnd w:id="30"/>
+    <w:bookmarkEnd w:id="31"/>
     <w:sectPr/>
   </w:body>
 </w:document>

</xml_diff>

<commit_message>
SEC-009: CLAUDE.md security checklist, simplicity rules and report sections; threat model and security guide; README on reading the checks; ADR-039
Co-Authored-By: Claude Opus 5.5 <noreply@anthropic.com>
</commit_message>
<xml_diff>
--- a/docs/export/project-history.docx
+++ b/docs/export/project-history.docx
@@ -94,7 +94,7 @@
               <w:pStyle w:val="Compact"/>
             </w:pPr>
             <w:r>
-              <w:t xml:space="preserve">1.0</w:t>
+              <w:t xml:space="preserve">1.2</w:t>
             </w:r>
           </w:p>
         </w:tc>
@@ -118,7 +118,7 @@
               <w:pStyle w:val="Compact"/>
             </w:pPr>
             <w:r>
-              <w:t xml:space="preserve">2026-10-16</w:t>
+              <w:t xml:space="preserve">2026-10-19</w:t>
             </w:r>
           </w:p>
         </w:tc>
@@ -2312,6 +2312,144 @@
           </w:p>
         </w:tc>
       </w:tr>
+      <w:tr>
+        <w:tc>
+          <w:tcPr/>
+          <w:p>
+            <w:pPr>
+              <w:pStyle w:val="Compact"/>
+            </w:pPr>
+            <w:r>
+              <w:t xml:space="preserve">#34</w:t>
+            </w:r>
+          </w:p>
+        </w:tc>
+        <w:tc>
+          <w:tcPr/>
+          <w:p>
+            <w:pPr>
+              <w:pStyle w:val="Compact"/>
+            </w:pPr>
+            <w:r>
+              <w:t xml:space="preserve">2026-10-16</w:t>
+            </w:r>
+          </w:p>
+        </w:tc>
+        <w:tc>
+          <w:tcPr/>
+          <w:p>
+            <w:pPr>
+              <w:pStyle w:val="Compact"/>
+            </w:pPr>
+            <w:r>
+              <w:t xml:space="preserve">Knowledge base: rulebook, generated schema reference, project history, progress log, Word and PDF copies</w:t>
+            </w:r>
+          </w:p>
+        </w:tc>
+        <w:tc>
+          <w:tcPr/>
+          <w:p>
+            <w:pPr>
+              <w:pStyle w:val="Compact"/>
+            </w:pPr>
+            <w:r>
+              <w:t xml:space="preserve">One place for every rule and table, with proof and history.</w:t>
+            </w:r>
+          </w:p>
+        </w:tc>
+      </w:tr>
+      <w:tr>
+        <w:tc>
+          <w:tcPr/>
+          <w:p>
+            <w:pPr>
+              <w:pStyle w:val="Compact"/>
+            </w:pPr>
+            <w:r>
+              <w:t xml:space="preserve">#35</w:t>
+            </w:r>
+          </w:p>
+        </w:tc>
+        <w:tc>
+          <w:tcPr/>
+          <w:p>
+            <w:pPr>
+              <w:pStyle w:val="Compact"/>
+            </w:pPr>
+            <w:r>
+              <w:t xml:space="preserve">2026-10-19</w:t>
+            </w:r>
+          </w:p>
+        </w:tc>
+        <w:tc>
+          <w:tcPr/>
+          <w:p>
+            <w:pPr>
+              <w:pStyle w:val="Compact"/>
+            </w:pPr>
+            <w:r>
+              <w:t xml:space="preserve">TallyPrime Edit Log checked like for like; seed case and test (no code change)</w:t>
+            </w:r>
+          </w:p>
+        </w:tc>
+        <w:tc>
+          <w:tcPr/>
+          <w:p>
+            <w:pPr>
+              <w:pStyle w:val="Compact"/>
+            </w:pPr>
+            <w:r>
+              <w:t xml:space="preserve">Confirm the platform works unchanged on Edit Log.</w:t>
+            </w:r>
+          </w:p>
+        </w:tc>
+      </w:tr>
+      <w:tr>
+        <w:tc>
+          <w:tcPr/>
+          <w:p>
+            <w:pPr>
+              <w:pStyle w:val="Compact"/>
+            </w:pPr>
+            <w:r>
+              <w:t xml:space="preserve">#36</w:t>
+            </w:r>
+          </w:p>
+        </w:tc>
+        <w:tc>
+          <w:tcPr/>
+          <w:p>
+            <w:pPr>
+              <w:pStyle w:val="Compact"/>
+            </w:pPr>
+            <w:r>
+              <w:t xml:space="preserve">2026-10-19</w:t>
+            </w:r>
+          </w:p>
+        </w:tc>
+        <w:tc>
+          <w:tcPr/>
+          <w:p>
+            <w:pPr>
+              <w:pStyle w:val="Compact"/>
+            </w:pPr>
+            <w:r>
+              <w:t xml:space="preserve">Security foundations: checks on every pull request, CLAUDE.md security checklist and report sections, threat model and security guide (SEC-009, ADR-039)</w:t>
+            </w:r>
+          </w:p>
+        </w:tc>
+        <w:tc>
+          <w:tcPr/>
+          <w:p>
+            <w:pPr>
+              <w:pStyle w:val="Compact"/>
+            </w:pPr>
+            <w:r>
+              <w:t xml:space="preserve">Catch bugs, vulnerable dependencies, insecure code and secrets before merging, ahead of M5.</w:t>
+            </w:r>
+          </w:p>
+        </w:tc>
+      </w:tr>
     </w:tbl>
     <w:bookmarkEnd w:id="24"/>
     <w:bookmarkStart w:id="25" w:name="problems-found-and-how-each-was-fixed"/>
@@ -3654,6 +3792,41 @@
             </w:pPr>
             <w:r>
               <w:t xml:space="preserve">Change</w:t>
+            </w:r>
+          </w:p>
+        </w:tc>
+      </w:tr>
+      <w:tr>
+        <w:tc>
+          <w:tcPr/>
+          <w:p>
+            <w:pPr>
+              <w:pStyle w:val="Compact"/>
+            </w:pPr>
+            <w:r>
+              <w:t xml:space="preserve">2026-10-19</w:t>
+            </w:r>
+          </w:p>
+        </w:tc>
+        <w:tc>
+          <w:tcPr/>
+          <w:p>
+            <w:pPr>
+              <w:pStyle w:val="Compact"/>
+            </w:pPr>
+            <w:r>
+              <w:t xml:space="preserve">1.2</w:t>
+            </w:r>
+          </w:p>
+        </w:tc>
+        <w:tc>
+          <w:tcPr/>
+          <w:p>
+            <w:pPr>
+              <w:pStyle w:val="Compact"/>
+            </w:pPr>
+            <w:r>
+              <w:t xml:space="preserve">PRs #34 to #36; security foundations.</w:t>
             </w:r>
           </w:p>
         </w:tc>

</xml_diff>

<commit_message>
DAT-013, VAL-015, RPT-012: the source's stock values and revaluations as source figures; Trial Balance, Profit & Loss and Balance Sheet checked against the source's own line by line (ADR-040)
Co-Authored-By: Claude Opus 5.5 <noreply@anthropic.com>
</commit_message>
<xml_diff>
--- a/docs/export/project-history.docx
+++ b/docs/export/project-history.docx
@@ -94,7 +94,7 @@
               <w:pStyle w:val="Compact"/>
             </w:pPr>
             <w:r>
-              <w:t xml:space="preserve">1.2</w:t>
+              <w:t xml:space="preserve">1.3</w:t>
             </w:r>
           </w:p>
         </w:tc>
@@ -2450,6 +2450,98 @@
           </w:p>
         </w:tc>
       </w:tr>
+      <w:tr>
+        <w:tc>
+          <w:tcPr/>
+          <w:p>
+            <w:pPr>
+              <w:pStyle w:val="Compact"/>
+            </w:pPr>
+            <w:r>
+              <w:t xml:space="preserve">#37 to #44</w:t>
+            </w:r>
+          </w:p>
+        </w:tc>
+        <w:tc>
+          <w:tcPr/>
+          <w:p>
+            <w:pPr>
+              <w:pStyle w:val="Compact"/>
+            </w:pPr>
+            <w:r>
+              <w:t xml:space="preserve">2026-10-19 to 2026-10-22</w:t>
+            </w:r>
+          </w:p>
+        </w:tc>
+        <w:tc>
+          <w:tcPr/>
+          <w:p>
+            <w:pPr>
+              <w:pStyle w:val="Compact"/>
+            </w:pPr>
+            <w:r>
+              <w:t xml:space="preserve">dev.ps1 tests on Windows in CI; A3 simplicity review (Tally connector, transform, validation and analyse, workers, scripts) with every result identical before and after; the review’s findings fixed</w:t>
+            </w:r>
+          </w:p>
+        </w:tc>
+        <w:tc>
+          <w:tcPr/>
+          <w:p>
+            <w:pPr>
+              <w:pStyle w:val="Compact"/>
+            </w:pPr>
+            <w:r>
+              <w:t xml:space="preserve">Code the developer can fully understand; bugs found on the way fixed with tests.</w:t>
+            </w:r>
+          </w:p>
+        </w:tc>
+      </w:tr>
+      <w:tr>
+        <w:tc>
+          <w:tcPr/>
+          <w:p>
+            <w:pPr>
+              <w:pStyle w:val="Compact"/>
+            </w:pPr>
+            <w:r>
+              <w:t xml:space="preserve">feat/stock-values</w:t>
+            </w:r>
+          </w:p>
+        </w:tc>
+        <w:tc>
+          <w:tcPr/>
+          <w:p>
+            <w:pPr>
+              <w:pStyle w:val="Compact"/>
+            </w:pPr>
+            <w:r>
+              <w:t xml:space="preserve">2026-10-22</w:t>
+            </w:r>
+          </w:p>
+        </w:tc>
+        <w:tc>
+          <w:tcPr/>
+          <w:p>
+            <w:pPr>
+              <w:pStyle w:val="Compact"/>
+            </w:pPr>
+            <w:r>
+              <w:t xml:space="preserve">The source’s stock values and foreign-currency revaluations stored as source figures; Trial Balance, Profit &amp; Loss and Balance Sheet laid out as Tally’s and checked against its own reports line by line (ADR-040)</w:t>
+            </w:r>
+          </w:p>
+        </w:tc>
+        <w:tc>
+          <w:tcPr/>
+          <w:p>
+            <w:pPr>
+              <w:pStyle w:val="Compact"/>
+            </w:pPr>
+            <w:r>
+              <w:t xml:space="preserve">Reports must equal Tally’s; recorded on the test company with integration on and off.</w:t>
+            </w:r>
+          </w:p>
+        </w:tc>
+      </w:tr>
     </w:tbl>
     <w:bookmarkEnd w:id="24"/>
     <w:bookmarkStart w:id="25" w:name="problems-found-and-how-each-was-fixed"/>
@@ -3750,7 +3842,8 @@
     <w:tbl>
       <w:tblPr>
         <w:tblStyle w:val="Table"/>
-        <w:tblW w:type="auto" w:w="0"/>
+        <w:tblW w:type="pct" w:w="5000"/>
+        <w:tblLayout w:type="fixed"/>
         <w:tblLook w:firstRow="1" w:lastRow="0" w:firstColumn="0" w:lastColumn="0" w:noHBand="0" w:noVBand="0" w:val="0020"/>
       </w:tblPr>
       <w:tblGrid>
@@ -3792,6 +3885,41 @@
             </w:pPr>
             <w:r>
               <w:t xml:space="preserve">Change</w:t>
+            </w:r>
+          </w:p>
+        </w:tc>
+      </w:tr>
+      <w:tr>
+        <w:tc>
+          <w:tcPr/>
+          <w:p>
+            <w:pPr>
+              <w:pStyle w:val="Compact"/>
+            </w:pPr>
+            <w:r>
+              <w:t xml:space="preserve">2026-10-22</w:t>
+            </w:r>
+          </w:p>
+        </w:tc>
+        <w:tc>
+          <w:tcPr/>
+          <w:p>
+            <w:pPr>
+              <w:pStyle w:val="Compact"/>
+            </w:pPr>
+            <w:r>
+              <w:t xml:space="preserve">1.3</w:t>
+            </w:r>
+          </w:p>
+        </w:tc>
+        <w:tc>
+          <w:tcPr/>
+          <w:p>
+            <w:pPr>
+              <w:pStyle w:val="Compact"/>
+            </w:pPr>
+            <w:r>
+              <w:t xml:space="preserve">PRs #37 to #44; statements from the source’s own figures.</w:t>
             </w:r>
           </w:p>
         </w:tc>

</xml_diff>

<commit_message>
DAT-013, VAL-015, RPT-012: the source's stock values and revaluations as source figures; Trial Balance, Profit & Loss and Balance Sheet checked against the source's own line by line (ADR-040) (#45)
Co-authored-by: Claude Opus 5.5 <noreply@anthropic.com>
</commit_message>
<xml_diff>
--- a/docs/export/project-history.docx
+++ b/docs/export/project-history.docx
@@ -94,7 +94,7 @@
               <w:pStyle w:val="Compact"/>
             </w:pPr>
             <w:r>
-              <w:t xml:space="preserve">1.2</w:t>
+              <w:t xml:space="preserve">1.3</w:t>
             </w:r>
           </w:p>
         </w:tc>
@@ -2450,6 +2450,98 @@
           </w:p>
         </w:tc>
       </w:tr>
+      <w:tr>
+        <w:tc>
+          <w:tcPr/>
+          <w:p>
+            <w:pPr>
+              <w:pStyle w:val="Compact"/>
+            </w:pPr>
+            <w:r>
+              <w:t xml:space="preserve">#37 to #44</w:t>
+            </w:r>
+          </w:p>
+        </w:tc>
+        <w:tc>
+          <w:tcPr/>
+          <w:p>
+            <w:pPr>
+              <w:pStyle w:val="Compact"/>
+            </w:pPr>
+            <w:r>
+              <w:t xml:space="preserve">2026-10-19 to 2026-10-22</w:t>
+            </w:r>
+          </w:p>
+        </w:tc>
+        <w:tc>
+          <w:tcPr/>
+          <w:p>
+            <w:pPr>
+              <w:pStyle w:val="Compact"/>
+            </w:pPr>
+            <w:r>
+              <w:t xml:space="preserve">dev.ps1 tests on Windows in CI; A3 simplicity review (Tally connector, transform, validation and analyse, workers, scripts) with every result identical before and after; the review’s findings fixed</w:t>
+            </w:r>
+          </w:p>
+        </w:tc>
+        <w:tc>
+          <w:tcPr/>
+          <w:p>
+            <w:pPr>
+              <w:pStyle w:val="Compact"/>
+            </w:pPr>
+            <w:r>
+              <w:t xml:space="preserve">Code the developer can fully understand; bugs found on the way fixed with tests.</w:t>
+            </w:r>
+          </w:p>
+        </w:tc>
+      </w:tr>
+      <w:tr>
+        <w:tc>
+          <w:tcPr/>
+          <w:p>
+            <w:pPr>
+              <w:pStyle w:val="Compact"/>
+            </w:pPr>
+            <w:r>
+              <w:t xml:space="preserve">feat/stock-values</w:t>
+            </w:r>
+          </w:p>
+        </w:tc>
+        <w:tc>
+          <w:tcPr/>
+          <w:p>
+            <w:pPr>
+              <w:pStyle w:val="Compact"/>
+            </w:pPr>
+            <w:r>
+              <w:t xml:space="preserve">2026-10-22</w:t>
+            </w:r>
+          </w:p>
+        </w:tc>
+        <w:tc>
+          <w:tcPr/>
+          <w:p>
+            <w:pPr>
+              <w:pStyle w:val="Compact"/>
+            </w:pPr>
+            <w:r>
+              <w:t xml:space="preserve">The source’s stock values and foreign-currency revaluations stored as source figures; Trial Balance, Profit &amp; Loss and Balance Sheet laid out as Tally’s and checked against its own reports line by line (ADR-040)</w:t>
+            </w:r>
+          </w:p>
+        </w:tc>
+        <w:tc>
+          <w:tcPr/>
+          <w:p>
+            <w:pPr>
+              <w:pStyle w:val="Compact"/>
+            </w:pPr>
+            <w:r>
+              <w:t xml:space="preserve">Reports must equal Tally’s; recorded on the test company with integration on and off.</w:t>
+            </w:r>
+          </w:p>
+        </w:tc>
+      </w:tr>
     </w:tbl>
     <w:bookmarkEnd w:id="24"/>
     <w:bookmarkStart w:id="25" w:name="problems-found-and-how-each-was-fixed"/>
@@ -3750,7 +3842,8 @@
     <w:tbl>
       <w:tblPr>
         <w:tblStyle w:val="Table"/>
-        <w:tblW w:type="auto" w:w="0"/>
+        <w:tblW w:type="pct" w:w="5000"/>
+        <w:tblLayout w:type="fixed"/>
         <w:tblLook w:firstRow="1" w:lastRow="0" w:firstColumn="0" w:lastColumn="0" w:noHBand="0" w:noVBand="0" w:val="0020"/>
       </w:tblPr>
       <w:tblGrid>
@@ -3792,6 +3885,41 @@
             </w:pPr>
             <w:r>
               <w:t xml:space="preserve">Change</w:t>
+            </w:r>
+          </w:p>
+        </w:tc>
+      </w:tr>
+      <w:tr>
+        <w:tc>
+          <w:tcPr/>
+          <w:p>
+            <w:pPr>
+              <w:pStyle w:val="Compact"/>
+            </w:pPr>
+            <w:r>
+              <w:t xml:space="preserve">2026-10-22</w:t>
+            </w:r>
+          </w:p>
+        </w:tc>
+        <w:tc>
+          <w:tcPr/>
+          <w:p>
+            <w:pPr>
+              <w:pStyle w:val="Compact"/>
+            </w:pPr>
+            <w:r>
+              <w:t xml:space="preserve">1.3</w:t>
+            </w:r>
+          </w:p>
+        </w:tc>
+        <w:tc>
+          <w:tcPr/>
+          <w:p>
+            <w:pPr>
+              <w:pStyle w:val="Compact"/>
+            </w:pPr>
+            <w:r>
+              <w:t xml:space="preserve">PRs #37 to #44; statements from the source’s own figures.</w:t>
             </w:r>
           </w:p>
         </w:tc>

</xml_diff>

<commit_message>
VAL-015: Educational mode year-end checks use the 31st or the 2nd, never the 1st (ADR-032 amended); long field paths recorded as a known limitation
Co-Authored-By: Claude Opus 5.5 <noreply@anthropic.com>
</commit_message>
<xml_diff>
--- a/docs/export/project-history.docx
+++ b/docs/export/project-history.docx
@@ -3800,6 +3800,30 @@
             </w:pPr>
             <w:r>
               <w:t xml:space="preserve">Designed (FX-001 to FX-013, ADR-037), planned for M4b; needs a foreign-currency voucher and a rate entered in TallyPrime first, to copy their exported fields.</w:t>
+            </w:r>
+          </w:p>
+        </w:tc>
+      </w:tr>
+      <w:tr>
+        <w:tc>
+          <w:tcPr/>
+          <w:p>
+            <w:pPr>
+              <w:pStyle w:val="Compact"/>
+            </w:pPr>
+            <w:r>
+              <w:t xml:space="preserve">Long field paths</w:t>
+            </w:r>
+          </w:p>
+        </w:tc>
+        <w:tc>
+          <w:tcPr/>
+          <w:p>
+            <w:pPr>
+              <w:pStyle w:val="Compact"/>
+            </w:pPr>
+            <w:r>
+              <w:t xml:space="preserve">The field catalogue keys a field by its path cut to 255 characters, so two paths differing only after that are counted as one (values are unaffected). Left until such paths appear; the fix is a schema change (rulebook Section 12).</w:t>
             </w:r>
           </w:p>
         </w:tc>

</xml_diff>

<commit_message>
VAL-015: Educational mode year-end checks use the 31st or the 2nd, never the 1st (ADR-032 amended); long field paths recorded as a known limitation (#46)
Co-authored-by: Claude Opus 5.5 <noreply@anthropic.com>
</commit_message>
<xml_diff>
--- a/docs/export/project-history.docx
+++ b/docs/export/project-history.docx
@@ -3800,6 +3800,30 @@
             </w:pPr>
             <w:r>
               <w:t xml:space="preserve">Designed (FX-001 to FX-013, ADR-037), planned for M4b; needs a foreign-currency voucher and a rate entered in TallyPrime first, to copy their exported fields.</w:t>
+            </w:r>
+          </w:p>
+        </w:tc>
+      </w:tr>
+      <w:tr>
+        <w:tc>
+          <w:tcPr/>
+          <w:p>
+            <w:pPr>
+              <w:pStyle w:val="Compact"/>
+            </w:pPr>
+            <w:r>
+              <w:t xml:space="preserve">Long field paths</w:t>
+            </w:r>
+          </w:p>
+        </w:tc>
+        <w:tc>
+          <w:tcPr/>
+          <w:p>
+            <w:pPr>
+              <w:pStyle w:val="Compact"/>
+            </w:pPr>
+            <w:r>
+              <w:t xml:space="preserve">The field catalogue keys a field by its path cut to 255 characters, so two paths differing only after that are counted as one (values are unaffected). Left until such paths appear; the fix is a schema change (rulebook Section 12).</w:t>
             </w:r>
           </w:p>
         </w:tc>

</xml_diff>

<commit_message>
VAL-015, RPT-012: statements laid out as Tally's for Direct Expenses and foreign-currency gains; a pilot-safe summary of statement differences (ADR-040)
Co-Authored-By: Claude Opus 5.5 <noreply@anthropic.com>
</commit_message>
<xml_diff>
--- a/docs/export/project-history.docx
+++ b/docs/export/project-history.docx
@@ -94,7 +94,7 @@
               <w:pStyle w:val="Compact"/>
             </w:pPr>
             <w:r>
-              <w:t xml:space="preserve">1.3</w:t>
+              <w:t xml:space="preserve">1.4</w:t>
             </w:r>
           </w:p>
         </w:tc>
@@ -118,7 +118,7 @@
               <w:pStyle w:val="Compact"/>
             </w:pPr>
             <w:r>
-              <w:t xml:space="preserve">2026-10-19</w:t>
+              <w:t xml:space="preserve">2026-10-23</w:t>
             </w:r>
           </w:p>
         </w:tc>
@@ -2504,7 +2504,7 @@
               <w:pStyle w:val="Compact"/>
             </w:pPr>
             <w:r>
-              <w:t xml:space="preserve">feat/stock-values</w:t>
+              <w:t xml:space="preserve">#45</w:t>
             </w:r>
           </w:p>
         </w:tc>
@@ -2538,6 +2538,98 @@
             </w:pPr>
             <w:r>
               <w:t xml:space="preserve">Reports must equal Tally’s; recorded on the test company with integration on and off.</w:t>
+            </w:r>
+          </w:p>
+        </w:tc>
+      </w:tr>
+      <w:tr>
+        <w:tc>
+          <w:tcPr/>
+          <w:p>
+            <w:pPr>
+              <w:pStyle w:val="Compact"/>
+            </w:pPr>
+            <w:r>
+              <w:t xml:space="preserve">#46</w:t>
+            </w:r>
+          </w:p>
+        </w:tc>
+        <w:tc>
+          <w:tcPr/>
+          <w:p>
+            <w:pPr>
+              <w:pStyle w:val="Compact"/>
+            </w:pPr>
+            <w:r>
+              <w:t xml:space="preserve">2026-10-22</w:t>
+            </w:r>
+          </w:p>
+        </w:tc>
+        <w:tc>
+          <w:tcPr/>
+          <w:p>
+            <w:pPr>
+              <w:pStyle w:val="Compact"/>
+            </w:pPr>
+            <w:r>
+              <w:t xml:space="preserve">Educational mode: year-end checks on the 31st or the 2nd, never the 1st (ADR-032 amended)</w:t>
+            </w:r>
+          </w:p>
+        </w:tc>
+        <w:tc>
+          <w:tcPr/>
+          <w:p>
+            <w:pPr>
+              <w:pStyle w:val="Compact"/>
+            </w:pPr>
+            <w:r>
+              <w:t xml:space="preserve">Tally’s computed profit on the 1st disagrees with its ledgers.</w:t>
+            </w:r>
+          </w:p>
+        </w:tc>
+      </w:tr>
+      <w:tr>
+        <w:tc>
+          <w:tcPr/>
+          <w:p>
+            <w:pPr>
+              <w:pStyle w:val="Compact"/>
+            </w:pPr>
+            <w:r>
+              <w:t xml:space="preserve">fix/statement-layout</w:t>
+            </w:r>
+          </w:p>
+        </w:tc>
+        <w:tc>
+          <w:tcPr/>
+          <w:p>
+            <w:pPr>
+              <w:pStyle w:val="Compact"/>
+            </w:pPr>
+            <w:r>
+              <w:t xml:space="preserve">2026-10-23</w:t>
+            </w:r>
+          </w:p>
+        </w:tc>
+        <w:tc>
+          <w:tcPr/>
+          <w:p>
+            <w:pPr>
+              <w:pStyle w:val="Compact"/>
+            </w:pPr>
+            <w:r>
+              <w:t xml:space="preserve">Direct Expenses inside Cost of Sales; the Trial Balance’s forex line split into losses and gains; a pilot-safe summary of statement differences</w:t>
+            </w:r>
+          </w:p>
+        </w:tc>
+        <w:tc>
+          <w:tcPr/>
+          <w:p>
+            <w:pPr>
+              <w:pStyle w:val="Compact"/>
+            </w:pPr>
+            <w:r>
+              <w:t xml:space="preserve">The pilot’s statement check failed on both companies (ledger checks all passing).</w:t>
             </w:r>
           </w:p>
         </w:tc>
@@ -3332,6 +3424,52 @@
           </w:p>
         </w:tc>
       </w:tr>
+      <w:tr>
+        <w:tc>
+          <w:tcPr/>
+          <w:p>
+            <w:pPr>
+              <w:pStyle w:val="Compact"/>
+            </w:pPr>
+            <w:r>
+              <w:t xml:space="preserve">Statements differing at every date (Profit &amp; Loss 2 lines, Trial Balance 4)</w:t>
+            </w:r>
+          </w:p>
+        </w:tc>
+        <w:tc>
+          <w:tcPr/>
+          <w:p>
+            <w:pPr>
+              <w:pStyle w:val="Compact"/>
+            </w:pPr>
+            <w:r>
+              <w:t xml:space="preserve">Tally puts Direct Expenses inside Cost of Sales and shows forex losses and gains in separate columns</w:t>
+            </w:r>
+          </w:p>
+        </w:tc>
+        <w:tc>
+          <w:tcPr/>
+          <w:p>
+            <w:pPr>
+              <w:pStyle w:val="Compact"/>
+            </w:pPr>
+            <w:r>
+              <w:t xml:space="preserve">Same layout, recorded on the seeded test company</w:t>
+            </w:r>
+          </w:p>
+        </w:tc>
+        <w:tc>
+          <w:tcPr/>
+          <w:p>
+            <w:pPr>
+              <w:pStyle w:val="Compact"/>
+            </w:pPr>
+            <w:r>
+              <w:t xml:space="preserve">fix/statement-layout</w:t>
+            </w:r>
+          </w:p>
+        </w:tc>
+      </w:tr>
     </w:tbl>
     <w:bookmarkEnd w:id="25"/>
     <w:bookmarkStart w:id="27" w:name="pilot-results-counts-only"/>
@@ -3435,6 +3573,28 @@
       </w:r>
       <w:r>
         <w:t xml:space="preserve">passes every check (104 as of 2026-10-02), with the stock-ledger and foreign-currency notes.</w:t>
+      </w:r>
+    </w:p>
+    <w:p>
+      <w:pPr>
+        <w:pStyle w:val="Compact"/>
+        <w:numPr>
+          <w:ilvl w:val="0"/>
+          <w:numId w:val="1001"/>
+        </w:numPr>
+      </w:pPr>
+      <w:r>
+        <w:rPr>
+          <w:b/>
+          <w:bCs/>
+        </w:rPr>
+        <w:t xml:space="preserve">Statements (after PR #45, 2026-10-23):</w:t>
+      </w:r>
+      <w:r>
+        <w:t xml:space="preserve"> </w:t>
+      </w:r>
+      <w:r>
+        <w:t xml:space="preserve">every ledger-level check passed on both companies; only the statement check failed: entity 2 (integrated) 6 lines at every date before its first year end, 10 at the year end and the next date, 8 after; entity 1 (not integrated, foreign-currency customers) about 10 at every date. The steady part was the Cost of Sales and forex layout (fix/statement-layout); the year-end part is to be read from the new summary.</w:t>
       </w:r>
     </w:p>
     <w:bookmarkStart w:id="26" w:name="tallyprime-edit-log-2026-10-19"/>
@@ -3909,6 +4069,41 @@
             </w:pPr>
             <w:r>
               <w:t xml:space="preserve">Change</w:t>
+            </w:r>
+          </w:p>
+        </w:tc>
+      </w:tr>
+      <w:tr>
+        <w:tc>
+          <w:tcPr/>
+          <w:p>
+            <w:pPr>
+              <w:pStyle w:val="Compact"/>
+            </w:pPr>
+            <w:r>
+              <w:t xml:space="preserve">2026-10-23</w:t>
+            </w:r>
+          </w:p>
+        </w:tc>
+        <w:tc>
+          <w:tcPr/>
+          <w:p>
+            <w:pPr>
+              <w:pStyle w:val="Compact"/>
+            </w:pPr>
+            <w:r>
+              <w:t xml:space="preserve">1.4</w:t>
+            </w:r>
+          </w:p>
+        </w:tc>
+        <w:tc>
+          <w:tcPr/>
+          <w:p>
+            <w:pPr>
+              <w:pStyle w:val="Compact"/>
+            </w:pPr>
+            <w:r>
+              <w:t xml:space="preserve">PRs #45 and #46; the statement layout fixes and the pilot-safe summary; long field paths.</w:t>
             </w:r>
           </w:p>
         </w:tc>

</xml_diff>

<commit_message>
VAL-015, RPT-012: statements laid out as Tally's for Direct Expenses and foreign-currency gains; a pilot-safe summary of statement differences (ADR-040) (#47)
Co-authored-by: Claude Opus 5.5 <noreply@anthropic.com>
</commit_message>
<xml_diff>
--- a/docs/export/project-history.docx
+++ b/docs/export/project-history.docx
@@ -94,7 +94,7 @@
               <w:pStyle w:val="Compact"/>
             </w:pPr>
             <w:r>
-              <w:t xml:space="preserve">1.3</w:t>
+              <w:t xml:space="preserve">1.4</w:t>
             </w:r>
           </w:p>
         </w:tc>
@@ -118,7 +118,7 @@
               <w:pStyle w:val="Compact"/>
             </w:pPr>
             <w:r>
-              <w:t xml:space="preserve">2026-10-19</w:t>
+              <w:t xml:space="preserve">2026-10-23</w:t>
             </w:r>
           </w:p>
         </w:tc>
@@ -2504,7 +2504,7 @@
               <w:pStyle w:val="Compact"/>
             </w:pPr>
             <w:r>
-              <w:t xml:space="preserve">feat/stock-values</w:t>
+              <w:t xml:space="preserve">#45</w:t>
             </w:r>
           </w:p>
         </w:tc>
@@ -2538,6 +2538,98 @@
             </w:pPr>
             <w:r>
               <w:t xml:space="preserve">Reports must equal Tally’s; recorded on the test company with integration on and off.</w:t>
+            </w:r>
+          </w:p>
+        </w:tc>
+      </w:tr>
+      <w:tr>
+        <w:tc>
+          <w:tcPr/>
+          <w:p>
+            <w:pPr>
+              <w:pStyle w:val="Compact"/>
+            </w:pPr>
+            <w:r>
+              <w:t xml:space="preserve">#46</w:t>
+            </w:r>
+          </w:p>
+        </w:tc>
+        <w:tc>
+          <w:tcPr/>
+          <w:p>
+            <w:pPr>
+              <w:pStyle w:val="Compact"/>
+            </w:pPr>
+            <w:r>
+              <w:t xml:space="preserve">2026-10-22</w:t>
+            </w:r>
+          </w:p>
+        </w:tc>
+        <w:tc>
+          <w:tcPr/>
+          <w:p>
+            <w:pPr>
+              <w:pStyle w:val="Compact"/>
+            </w:pPr>
+            <w:r>
+              <w:t xml:space="preserve">Educational mode: year-end checks on the 31st or the 2nd, never the 1st (ADR-032 amended)</w:t>
+            </w:r>
+          </w:p>
+        </w:tc>
+        <w:tc>
+          <w:tcPr/>
+          <w:p>
+            <w:pPr>
+              <w:pStyle w:val="Compact"/>
+            </w:pPr>
+            <w:r>
+              <w:t xml:space="preserve">Tally’s computed profit on the 1st disagrees with its ledgers.</w:t>
+            </w:r>
+          </w:p>
+        </w:tc>
+      </w:tr>
+      <w:tr>
+        <w:tc>
+          <w:tcPr/>
+          <w:p>
+            <w:pPr>
+              <w:pStyle w:val="Compact"/>
+            </w:pPr>
+            <w:r>
+              <w:t xml:space="preserve">fix/statement-layout</w:t>
+            </w:r>
+          </w:p>
+        </w:tc>
+        <w:tc>
+          <w:tcPr/>
+          <w:p>
+            <w:pPr>
+              <w:pStyle w:val="Compact"/>
+            </w:pPr>
+            <w:r>
+              <w:t xml:space="preserve">2026-10-23</w:t>
+            </w:r>
+          </w:p>
+        </w:tc>
+        <w:tc>
+          <w:tcPr/>
+          <w:p>
+            <w:pPr>
+              <w:pStyle w:val="Compact"/>
+            </w:pPr>
+            <w:r>
+              <w:t xml:space="preserve">Direct Expenses inside Cost of Sales; the Trial Balance’s forex line split into losses and gains; a pilot-safe summary of statement differences</w:t>
+            </w:r>
+          </w:p>
+        </w:tc>
+        <w:tc>
+          <w:tcPr/>
+          <w:p>
+            <w:pPr>
+              <w:pStyle w:val="Compact"/>
+            </w:pPr>
+            <w:r>
+              <w:t xml:space="preserve">The pilot’s statement check failed on both companies (ledger checks all passing).</w:t>
             </w:r>
           </w:p>
         </w:tc>
@@ -3332,6 +3424,52 @@
           </w:p>
         </w:tc>
       </w:tr>
+      <w:tr>
+        <w:tc>
+          <w:tcPr/>
+          <w:p>
+            <w:pPr>
+              <w:pStyle w:val="Compact"/>
+            </w:pPr>
+            <w:r>
+              <w:t xml:space="preserve">Statements differing at every date (Profit &amp; Loss 2 lines, Trial Balance 4)</w:t>
+            </w:r>
+          </w:p>
+        </w:tc>
+        <w:tc>
+          <w:tcPr/>
+          <w:p>
+            <w:pPr>
+              <w:pStyle w:val="Compact"/>
+            </w:pPr>
+            <w:r>
+              <w:t xml:space="preserve">Tally puts Direct Expenses inside Cost of Sales and shows forex losses and gains in separate columns</w:t>
+            </w:r>
+          </w:p>
+        </w:tc>
+        <w:tc>
+          <w:tcPr/>
+          <w:p>
+            <w:pPr>
+              <w:pStyle w:val="Compact"/>
+            </w:pPr>
+            <w:r>
+              <w:t xml:space="preserve">Same layout, recorded on the seeded test company</w:t>
+            </w:r>
+          </w:p>
+        </w:tc>
+        <w:tc>
+          <w:tcPr/>
+          <w:p>
+            <w:pPr>
+              <w:pStyle w:val="Compact"/>
+            </w:pPr>
+            <w:r>
+              <w:t xml:space="preserve">fix/statement-layout</w:t>
+            </w:r>
+          </w:p>
+        </w:tc>
+      </w:tr>
     </w:tbl>
     <w:bookmarkEnd w:id="25"/>
     <w:bookmarkStart w:id="27" w:name="pilot-results-counts-only"/>
@@ -3435,6 +3573,28 @@
       </w:r>
       <w:r>
         <w:t xml:space="preserve">passes every check (104 as of 2026-10-02), with the stock-ledger and foreign-currency notes.</w:t>
+      </w:r>
+    </w:p>
+    <w:p>
+      <w:pPr>
+        <w:pStyle w:val="Compact"/>
+        <w:numPr>
+          <w:ilvl w:val="0"/>
+          <w:numId w:val="1001"/>
+        </w:numPr>
+      </w:pPr>
+      <w:r>
+        <w:rPr>
+          <w:b/>
+          <w:bCs/>
+        </w:rPr>
+        <w:t xml:space="preserve">Statements (after PR #45, 2026-10-23):</w:t>
+      </w:r>
+      <w:r>
+        <w:t xml:space="preserve"> </w:t>
+      </w:r>
+      <w:r>
+        <w:t xml:space="preserve">every ledger-level check passed on both companies; only the statement check failed: entity 2 (integrated) 6 lines at every date before its first year end, 10 at the year end and the next date, 8 after; entity 1 (not integrated, foreign-currency customers) about 10 at every date. The steady part was the Cost of Sales and forex layout (fix/statement-layout); the year-end part is to be read from the new summary.</w:t>
       </w:r>
     </w:p>
     <w:bookmarkStart w:id="26" w:name="tallyprime-edit-log-2026-10-19"/>
@@ -3909,6 +4069,41 @@
             </w:pPr>
             <w:r>
               <w:t xml:space="preserve">Change</w:t>
+            </w:r>
+          </w:p>
+        </w:tc>
+      </w:tr>
+      <w:tr>
+        <w:tc>
+          <w:tcPr/>
+          <w:p>
+            <w:pPr>
+              <w:pStyle w:val="Compact"/>
+            </w:pPr>
+            <w:r>
+              <w:t xml:space="preserve">2026-10-23</w:t>
+            </w:r>
+          </w:p>
+        </w:tc>
+        <w:tc>
+          <w:tcPr/>
+          <w:p>
+            <w:pPr>
+              <w:pStyle w:val="Compact"/>
+            </w:pPr>
+            <w:r>
+              <w:t xml:space="preserve">1.4</w:t>
+            </w:r>
+          </w:p>
+        </w:tc>
+        <w:tc>
+          <w:tcPr/>
+          <w:p>
+            <w:pPr>
+              <w:pStyle w:val="Compact"/>
+            </w:pPr>
+            <w:r>
+              <w:t xml:space="preserve">PRs #45 and #46; the statement layout fixes and the pilot-safe summary; long field paths.</w:t>
             </w:r>
           </w:p>
         </w:tc>

</xml_diff>

<commit_message>
VAL-015, RPT-012: statement matching finished: the expected company only (ADR-041), Trial Balance netting (ADR-042), the test company across a year end, stock ledgers at the source's stock, lines taken from the source where no rule is known (ADR-043)
Co-Authored-By: Claude Opus 5.5 <noreply@anthropic.com>
</commit_message>
<xml_diff>
--- a/docs/export/project-history.docx
+++ b/docs/export/project-history.docx
@@ -2596,7 +2596,7 @@
               <w:pStyle w:val="Compact"/>
             </w:pPr>
             <w:r>
-              <w:t xml:space="preserve">fix/statement-layout</w:t>
+              <w:t xml:space="preserve">#47</w:t>
             </w:r>
           </w:p>
         </w:tc>
@@ -2630,6 +2630,98 @@
             </w:pPr>
             <w:r>
               <w:t xml:space="preserve">The pilot’s statement check failed on both companies (ledger checks all passing).</w:t>
+            </w:r>
+          </w:p>
+        </w:tc>
+      </w:tr>
+      <w:tr>
+        <w:tc>
+          <w:tcPr/>
+          <w:p>
+            <w:pPr>
+              <w:pStyle w:val="Compact"/>
+            </w:pPr>
+            <w:r>
+              <w:t xml:space="preserve">fix/statements-final</w:t>
+            </w:r>
+          </w:p>
+        </w:tc>
+        <w:tc>
+          <w:tcPr/>
+          <w:p>
+            <w:pPr>
+              <w:pStyle w:val="Compact"/>
+            </w:pPr>
+            <w:r>
+              <w:t xml:space="preserve">2026-10-24</w:t>
+            </w:r>
+          </w:p>
+        </w:tc>
+        <w:tc>
+          <w:tcPr/>
+          <w:p>
+            <w:pPr>
+              <w:pStyle w:val="Compact"/>
+            </w:pPr>
+            <w:r>
+              <w:t xml:space="preserve">The expected company guard (LB-SYNC-011, ADR-041); Trial Balance netting (ADR-042); the test company across a year end; stock ledgers at the source’s stock in both settings; lines taken from the source where no rule is known (ADR-043)</w:t>
+            </w:r>
+          </w:p>
+        </w:tc>
+        <w:tc>
+          <w:tcPr/>
+          <w:p>
+            <w:pPr>
+              <w:pStyle w:val="Compact"/>
+            </w:pPr>
+            <w:r>
+              <w:t xml:space="preserve">Finish statement matching for both pilot companies.</w:t>
+            </w:r>
+          </w:p>
+        </w:tc>
+      </w:tr>
+      <w:tr>
+        <w:tc>
+          <w:tcPr/>
+          <w:p>
+            <w:pPr>
+              <w:pStyle w:val="Compact"/>
+            </w:pPr>
+            <w:r>
+              <w:t xml:space="preserve">#48</w:t>
+            </w:r>
+          </w:p>
+        </w:tc>
+        <w:tc>
+          <w:tcPr/>
+          <w:p>
+            <w:pPr>
+              <w:pStyle w:val="Compact"/>
+            </w:pPr>
+            <w:r>
+              <w:t xml:space="preserve">2026-10-24</w:t>
+            </w:r>
+          </w:p>
+        </w:tc>
+        <w:tc>
+          <w:tcPr/>
+          <w:p>
+            <w:pPr>
+              <w:pStyle w:val="Compact"/>
+            </w:pPr>
+            <w:r>
+              <w:t xml:space="preserve">More tested amounts in the summary (netted split, other stock figures, foreign-currency openings); the report blames the layout when every ledger check passes</w:t>
+            </w:r>
+          </w:p>
+        </w:tc>
+        <w:tc>
+          <w:tcPr/>
+          <w:p>
+            <w:pPr>
+              <w:pStyle w:val="Compact"/>
+            </w:pPr>
+            <w:r>
+              <w:t xml:space="preserve">The pilot’s remaining statement differences.</w:t>
             </w:r>
           </w:p>
         </w:tc>
@@ -3465,7 +3557,7 @@
               <w:pStyle w:val="Compact"/>
             </w:pPr>
             <w:r>
-              <w:t xml:space="preserve">fix/statement-layout</w:t>
+              <w:t xml:space="preserve">#47</w:t>
             </w:r>
           </w:p>
         </w:tc>
@@ -3572,7 +3664,7 @@
         <w:t xml:space="preserve"> </w:t>
       </w:r>
       <w:r>
-        <w:t xml:space="preserve">passes every check (104 as of 2026-10-02), with the stock-ledger and foreign-currency notes.</w:t>
+        <w:t xml:space="preserve">passes every check (104 as of 2026-10-02), with the stock-ledger and foreign-currency notes. From 2026-10-24 its books begin on 1 April 2025 (a year end on 31 March 2026): 278 checks, statements equal at all 18 month ends.</w:t>
       </w:r>
     </w:p>
     <w:p>

</xml_diff>

<commit_message>
VAL-015: Word and PDF copies of the docs
Co-Authored-By: Claude Opus 5.5 <noreply@anthropic.com>
</commit_message>
<xml_diff>
--- a/docs/export/project-history.docx
+++ b/docs/export/project-history.docx
@@ -2642,7 +2642,68 @@
               <w:pStyle w:val="Compact"/>
             </w:pPr>
             <w:r>
-              <w:t xml:space="preserve">fix/statements-final</w:t>
+              <w:t xml:space="preserve">fix/forex-group-stopgap</w:t>
+            </w:r>
+          </w:p>
+        </w:tc>
+        <w:tc>
+          <w:tcPr/>
+          <w:p>
+            <w:pPr>
+              <w:pStyle w:val="Compact"/>
+            </w:pPr>
+            <w:r>
+              <w:t xml:space="preserve">2026-10-24</w:t>
+            </w:r>
+          </w:p>
+        </w:tc>
+        <w:tc>
+          <w:tcPr/>
+          <w:p>
+            <w:pPr>
+              <w:pStyle w:val="Compact"/>
+            </w:pPr>
+            <w:r>
+              <w:t xml:space="preserve">Temporary stopgap: Current Assets taken from Tally where ours differs at dates Tally shows its forex line, with a reconciling line; open differences reported (LB-VAL-026), the view</w:t>
+            </w:r>
+            <w:r>
+              <w:t xml:space="preserve"> </w:t>
+            </w:r>
+            <w:r>
+              <w:rPr>
+                <w:rStyle w:val="VerbatimChar"/>
+              </w:rPr>
+              <w:t xml:space="preserve">v_statement_open_differences</w:t>
+            </w:r>
+            <w:r>
+              <w:t xml:space="preserve"> </w:t>
+            </w:r>
+            <w:r>
+              <w:t xml:space="preserve">(ADR-043)</w:t>
+            </w:r>
+          </w:p>
+        </w:tc>
+        <w:tc>
+          <w:tcPr/>
+          <w:p>
+            <w:pPr>
+              <w:pStyle w:val="Compact"/>
+            </w:pPr>
+            <w:r>
+              <w:t xml:space="preserve">Entity 1 differed at 18 of 78 dates with no rule found.</w:t>
+            </w:r>
+          </w:p>
+        </w:tc>
+      </w:tr>
+      <w:tr>
+        <w:tc>
+          <w:tcPr/>
+          <w:p>
+            <w:pPr>
+              <w:pStyle w:val="Compact"/>
+            </w:pPr>
+            <w:r>
+              <w:t xml:space="preserve">#48</w:t>
             </w:r>
           </w:p>
         </w:tc>

</xml_diff>

<commit_message>
VAL-015: temporary stopgap for Current Assets with foreign-currency ledgers (ADR-043, LB-VAL-026) (#49)
* VAL-015, RPT-012: temporary stopgap (ADR-043): a group holding foreign-currency ledgers taken from the source where ours differs and the source shows its forex line, with a reconciling line; open differences reported (LB-VAL-026, OK with warnings); v_statement_open_differences (migration 0018)

Co-Authored-By: Claude Opus 5.5 <noreply@anthropic.com>

* VAL-015: Word and PDF copies of the docs

Co-Authored-By: Claude Opus 5.5 <noreply@anthropic.com>

---------

Co-authored-by: Claude Opus 5.5 <noreply@anthropic.com>
</commit_message>
<xml_diff>
--- a/docs/export/project-history.docx
+++ b/docs/export/project-history.docx
@@ -2642,7 +2642,68 @@
               <w:pStyle w:val="Compact"/>
             </w:pPr>
             <w:r>
-              <w:t xml:space="preserve">fix/statements-final</w:t>
+              <w:t xml:space="preserve">fix/forex-group-stopgap</w:t>
+            </w:r>
+          </w:p>
+        </w:tc>
+        <w:tc>
+          <w:tcPr/>
+          <w:p>
+            <w:pPr>
+              <w:pStyle w:val="Compact"/>
+            </w:pPr>
+            <w:r>
+              <w:t xml:space="preserve">2026-10-24</w:t>
+            </w:r>
+          </w:p>
+        </w:tc>
+        <w:tc>
+          <w:tcPr/>
+          <w:p>
+            <w:pPr>
+              <w:pStyle w:val="Compact"/>
+            </w:pPr>
+            <w:r>
+              <w:t xml:space="preserve">Temporary stopgap: Current Assets taken from Tally where ours differs at dates Tally shows its forex line, with a reconciling line; open differences reported (LB-VAL-026), the view</w:t>
+            </w:r>
+            <w:r>
+              <w:t xml:space="preserve"> </w:t>
+            </w:r>
+            <w:r>
+              <w:rPr>
+                <w:rStyle w:val="VerbatimChar"/>
+              </w:rPr>
+              <w:t xml:space="preserve">v_statement_open_differences</w:t>
+            </w:r>
+            <w:r>
+              <w:t xml:space="preserve"> </w:t>
+            </w:r>
+            <w:r>
+              <w:t xml:space="preserve">(ADR-043)</w:t>
+            </w:r>
+          </w:p>
+        </w:tc>
+        <w:tc>
+          <w:tcPr/>
+          <w:p>
+            <w:pPr>
+              <w:pStyle w:val="Compact"/>
+            </w:pPr>
+            <w:r>
+              <w:t xml:space="preserve">Entity 1 differed at 18 of 78 dates with no rule found.</w:t>
+            </w:r>
+          </w:p>
+        </w:tc>
+      </w:tr>
+      <w:tr>
+        <w:tc>
+          <w:tcPr/>
+          <w:p>
+            <w:pPr>
+              <w:pStyle w:val="Compact"/>
+            </w:pPr>
+            <w:r>
+              <w:t xml:space="preserve">#48</w:t>
             </w:r>
           </w:p>
         </w:tc>

</xml_diff>

<commit_message>
A5/ADR-046: docs for the foreign currency core and the fx-rules finder
Architecture 0.42 (ADR-046), rulebook 1.11 (section 18), schema 0.36 (4.8 as built),
codebase guide 0.27, pilot runbook 0.29, README and CLAUDE.md commands, progress log,
project history, regenerated diagrams, schema reference, error catalogue and exports.

Co-Authored-By: Claude Opus 5.5 <noreply@anthropic.com>
</commit_message>
<xml_diff>
--- a/docs/export/project-history.docx
+++ b/docs/export/project-history.docx
@@ -2642,7 +2642,237 @@
               <w:pStyle w:val="Compact"/>
             </w:pPr>
             <w:r>
-              <w:t xml:space="preserve">fix/forex-group-stopgap</w:t>
+              <w:t xml:space="preserve">feat/a5-fx-core</w:t>
+            </w:r>
+          </w:p>
+        </w:tc>
+        <w:tc>
+          <w:tcPr/>
+          <w:p>
+            <w:pPr>
+              <w:pStyle w:val="Compact"/>
+            </w:pPr>
+            <w:r>
+              <w:t xml:space="preserve">2026-10-24</w:t>
+            </w:r>
+          </w:p>
+        </w:tc>
+        <w:tc>
+          <w:tcPr/>
+          <w:p>
+            <w:pPr>
+              <w:pStyle w:val="Compact"/>
+            </w:pPr>
+            <w:r>
+              <w:t xml:space="preserve">Foreign currency beside the books (currency, rate, foreign openings, currency masters, rates), the base check after a rebuild, the fx-rules finder (ADR-046)</w:t>
+            </w:r>
+          </w:p>
+        </w:tc>
+        <w:tc>
+          <w:tcPr/>
+          <w:p>
+            <w:pPr>
+              <w:pStyle w:val="Compact"/>
+            </w:pPr>
+            <w:r>
+              <w:t xml:space="preserve">A5 before M5; find the rule behind ADR-043’s stopgap from the pilot’s own data.</w:t>
+            </w:r>
+          </w:p>
+        </w:tc>
+      </w:tr>
+      <w:tr>
+        <w:tc>
+          <w:tcPr/>
+          <w:p>
+            <w:pPr>
+              <w:pStyle w:val="Compact"/>
+            </w:pPr>
+            <w:r>
+              <w:t xml:space="preserve">#54</w:t>
+            </w:r>
+          </w:p>
+        </w:tc>
+        <w:tc>
+          <w:tcPr/>
+          <w:p>
+            <w:pPr>
+              <w:pStyle w:val="Compact"/>
+            </w:pPr>
+            <w:r>
+              <w:t xml:space="preserve">2026-10-24</w:t>
+            </w:r>
+          </w:p>
+        </w:tc>
+        <w:tc>
+          <w:tcPr/>
+          <w:p>
+            <w:pPr>
+              <w:pStyle w:val="Compact"/>
+            </w:pPr>
+            <w:r>
+              <w:t xml:space="preserve">Images stamped with their commit; the pilot refuses other code (ADR-045)</w:t>
+            </w:r>
+          </w:p>
+        </w:tc>
+        <w:tc>
+          <w:tcPr/>
+          <w:p>
+            <w:pPr>
+              <w:pStyle w:val="Compact"/>
+            </w:pPr>
+            <w:r>
+              <w:t xml:space="preserve">Pilot ran an old image after an update.</w:t>
+            </w:r>
+          </w:p>
+        </w:tc>
+      </w:tr>
+      <w:tr>
+        <w:tc>
+          <w:tcPr/>
+          <w:p>
+            <w:pPr>
+              <w:pStyle w:val="Compact"/>
+            </w:pPr>
+            <w:r>
+              <w:t xml:space="preserve">fix/verdicts-alerts-open-items</w:t>
+            </w:r>
+          </w:p>
+        </w:tc>
+        <w:tc>
+          <w:tcPr/>
+          <w:p>
+            <w:pPr>
+              <w:pStyle w:val="Compact"/>
+            </w:pPr>
+            <w:r>
+              <w:t xml:space="preserve">2026-10-24</w:t>
+            </w:r>
+          </w:p>
+        </w:tc>
+        <w:tc>
+          <w:tcPr/>
+          <w:p>
+            <w:pPr>
+              <w:pStyle w:val="Compact"/>
+            </w:pPr>
+            <w:r>
+              <w:t xml:space="preserve">Verdicts and exit codes, open items, alert reasons (migration 0019), pilot backups (ADR-044)</w:t>
+            </w:r>
+          </w:p>
+        </w:tc>
+        <w:tc>
+          <w:tcPr/>
+          <w:p>
+            <w:pPr>
+              <w:pStyle w:val="Compact"/>
+            </w:pPr>
+            <w:r>
+              <w:t xml:space="preserve">Pilot: warnings read as needing action, report exited 1, a stale alert.</w:t>
+            </w:r>
+          </w:p>
+        </w:tc>
+      </w:tr>
+      <w:tr>
+        <w:tc>
+          <w:tcPr/>
+          <w:p>
+            <w:pPr>
+              <w:pStyle w:val="Compact"/>
+            </w:pPr>
+            <w:r>
+              <w:t xml:space="preserve">#51</w:t>
+            </w:r>
+          </w:p>
+        </w:tc>
+        <w:tc>
+          <w:tcPr/>
+          <w:p>
+            <w:pPr>
+              <w:pStyle w:val="Compact"/>
+            </w:pPr>
+            <w:r>
+              <w:t xml:space="preserve">2026-10-24</w:t>
+            </w:r>
+          </w:p>
+        </w:tc>
+        <w:tc>
+          <w:tcPr/>
+          <w:p>
+            <w:pPr>
+              <w:pStyle w:val="Compact"/>
+            </w:pPr>
+            <w:r>
+              <w:t xml:space="preserve">Open differences under their own heading; an alert without a company resolved</w:t>
+            </w:r>
+          </w:p>
+        </w:tc>
+        <w:tc>
+          <w:tcPr/>
+          <w:p>
+            <w:pPr>
+              <w:pStyle w:val="Compact"/>
+            </w:pPr>
+            <w:r>
+              <w:t xml:space="preserve">Pilot output.</w:t>
+            </w:r>
+          </w:p>
+        </w:tc>
+      </w:tr>
+      <w:tr>
+        <w:tc>
+          <w:tcPr/>
+          <w:p>
+            <w:pPr>
+              <w:pStyle w:val="Compact"/>
+            </w:pPr>
+            <w:r>
+              <w:t xml:space="preserve">#50</w:t>
+            </w:r>
+          </w:p>
+        </w:tc>
+        <w:tc>
+          <w:tcPr/>
+          <w:p>
+            <w:pPr>
+              <w:pStyle w:val="Compact"/>
+            </w:pPr>
+            <w:r>
+              <w:t xml:space="preserve">2026-10-24</w:t>
+            </w:r>
+          </w:p>
+        </w:tc>
+        <w:tc>
+          <w:tcPr/>
+          <w:p>
+            <w:pPr>
+              <w:pStyle w:val="Compact"/>
+            </w:pPr>
+            <w:r>
+              <w:t xml:space="preserve">The Balance Sheet stock fallback retired</w:t>
+            </w:r>
+          </w:p>
+        </w:tc>
+        <w:tc>
+          <w:tcPr/>
+          <w:p>
+            <w:pPr>
+              <w:pStyle w:val="Compact"/>
+            </w:pPr>
+            <w:r>
+              <w:t xml:space="preserve">Ours matched the pilot at every date.</w:t>
+            </w:r>
+          </w:p>
+        </w:tc>
+      </w:tr>
+      <w:tr>
+        <w:tc>
+          <w:tcPr/>
+          <w:p>
+            <w:pPr>
+              <w:pStyle w:val="Compact"/>
+            </w:pPr>
+            <w:r>
+              <w:t xml:space="preserve">#49</w:t>
             </w:r>
           </w:p>
         </w:tc>
@@ -4137,6 +4367,30 @@
             </w:pPr>
             <w:r>
               <w:t xml:space="preserve">The field catalogue keys a field by its path cut to 255 characters, so two paths differing only after that are counted as one (values are unaffected). Left until such paths appear; the fix is a schema change (rulebook Section 12).</w:t>
+            </w:r>
+          </w:p>
+        </w:tc>
+      </w:tr>
+      <w:tr>
+        <w:tc>
+          <w:tcPr/>
+          <w:p>
+            <w:pPr>
+              <w:pStyle w:val="Compact"/>
+            </w:pPr>
+            <w:r>
+              <w:t xml:space="preserve">Forex revaluation rule (ADR-043)</w:t>
+            </w:r>
+          </w:p>
+        </w:tc>
+        <w:tc>
+          <w:tcPr/>
+          <w:p>
+            <w:pPr>
+              <w:pStyle w:val="Compact"/>
+            </w:pPr>
+            <w:r>
+              <w:t xml:space="preserve">Entity 1’s Current Assets is taken from Tally at 18 dates (open differences, LB-VAL-026) until the rule Tally’s Balance Sheet revalues by is found; read-only checks in the client’s Tally pending.</w:t>
             </w:r>
           </w:p>
         </w:tc>

</xml_diff>

<commit_message>
ADR-043: docs for the time-box, the finder's three parts and stale validations
Architecture 0.43 (ADR-043 time-box, ADR-044, ADR-046), rulebook 1.12, codebase guide 0.28,
pilot runbook 0.30 (stop the test stack before loading client companies), progress log,
project history, exports.

Co-Authored-By: Claude Opus 5.5 <noreply@anthropic.com>
</commit_message>
<xml_diff>
--- a/docs/export/project-history.docx
+++ b/docs/export/project-history.docx
@@ -2642,7 +2642,53 @@
               <w:pStyle w:val="Compact"/>
             </w:pPr>
             <w:r>
-              <w:t xml:space="preserve">feat/a5-fx-core</w:t>
+              <w:t xml:space="preserve">feat/a5-fx-finder</w:t>
+            </w:r>
+          </w:p>
+        </w:tc>
+        <w:tc>
+          <w:tcPr/>
+          <w:p>
+            <w:pPr>
+              <w:pStyle w:val="Compact"/>
+            </w:pPr>
+            <w:r>
+              <w:t xml:space="preserve">2026-10-26</w:t>
+            </w:r>
+          </w:p>
+        </w:tc>
+        <w:tc>
+          <w:tcPr/>
+          <w:p>
+            <w:pPr>
+              <w:pStyle w:val="Compact"/>
+            </w:pPr>
+            <w:r>
+              <w:t xml:space="preserve">The fx-rules finder in three parts; a validation older than the data needs action (LB-VAL-027, LB-VAL-028)</w:t>
+            </w:r>
+          </w:p>
+        </w:tc>
+        <w:tc>
+          <w:tcPr/>
+          <w:p>
+            <w:pPr>
+              <w:pStyle w:val="Compact"/>
+            </w:pPr>
+            <w:r>
+              <w:t xml:space="preserve">ADR-043’s time-boxed last round; the pilot’s report hid a validation that couldn’t run.</w:t>
+            </w:r>
+          </w:p>
+        </w:tc>
+      </w:tr>
+      <w:tr>
+        <w:tc>
+          <w:tcPr/>
+          <w:p>
+            <w:pPr>
+              <w:pStyle w:val="Compact"/>
+            </w:pPr>
+            <w:r>
+              <w:t xml:space="preserve">#55</w:t>
             </w:r>
           </w:p>
         </w:tc>

</xml_diff>

<commit_message>
RPT-013: Word and PDF exports of the rulebook, schema reference and history
Co-Authored-By: Claude Opus 5.5 <noreply@anthropic.com>
</commit_message>
<xml_diff>
--- a/docs/export/project-history.docx
+++ b/docs/export/project-history.docx
@@ -2642,7 +2642,53 @@
               <w:pStyle w:val="Compact"/>
             </w:pPr>
             <w:r>
-              <w:t xml:space="preserve">feat/a5-fx-finder</w:t>
+              <w:t xml:space="preserve">feat/monthly-sales-report</w:t>
+            </w:r>
+          </w:p>
+        </w:tc>
+        <w:tc>
+          <w:tcPr/>
+          <w:p>
+            <w:pPr>
+              <w:pStyle w:val="Compact"/>
+            </w:pPr>
+            <w:r>
+              <w:t xml:space="preserve">2026-10-29</w:t>
+            </w:r>
+          </w:p>
+        </w:tc>
+        <w:tc>
+          <w:tcPr/>
+          <w:p>
+            <w:pPr>
+              <w:pStyle w:val="Compact"/>
+            </w:pPr>
+            <w:r>
+              <w:t xml:space="preserve">Monthly sales views over the source’s own Sales Accounts group, a ready-to-run pivot, and their proof against Tally’s Sales Accounts line between the stored statement dates (RPT-013, ADR-047)</w:t>
+            </w:r>
+          </w:p>
+        </w:tc>
+        <w:tc>
+          <w:tcPr/>
+          <w:p>
+            <w:pPr>
+              <w:pStyle w:val="Compact"/>
+            </w:pPr>
+            <w:r>
+              <w:t xml:space="preserve">Accountants built the report by hand and missed debit notes and journals posting to sales ledgers.</w:t>
+            </w:r>
+          </w:p>
+        </w:tc>
+      </w:tr>
+      <w:tr>
+        <w:tc>
+          <w:tcPr/>
+          <w:p>
+            <w:pPr>
+              <w:pStyle w:val="Compact"/>
+            </w:pPr>
+            <w:r>
+              <w:t xml:space="preserve">#56</w:t>
             </w:r>
           </w:p>
         </w:tc>

</xml_diff>

<commit_message>
RPT-012/FX-001: docs for Cost of Sales without stock and ledger currencies
Architecture 0.45 (ADR-040, ADR-044, ADR-046), schema 0.38, rulebook 1.14, codebase guide
0.30, pilot runbook 0.32, CLAUDE.md, progress log, project history, exports.

Co-Authored-By: Claude Opus 5.5 <noreply@anthropic.com>
</commit_message>
<xml_diff>
--- a/docs/export/project-history.docx
+++ b/docs/export/project-history.docx
@@ -2642,7 +2642,65 @@
               <w:pStyle w:val="Compact"/>
             </w:pPr>
             <w:r>
-              <w:t xml:space="preserve">feat/monthly-sales-report</w:t>
+              <w:t xml:space="preserve">fix/cost-of-sales-and-ledger-currency</w:t>
+            </w:r>
+          </w:p>
+        </w:tc>
+        <w:tc>
+          <w:tcPr/>
+          <w:p>
+            <w:pPr>
+              <w:pStyle w:val="Compact"/>
+            </w:pPr>
+            <w:r>
+              <w:t xml:space="preserve">2026-10-30</w:t>
+            </w:r>
+          </w:p>
+        </w:tc>
+        <w:tc>
+          <w:tcPr/>
+          <w:p>
+            <w:pPr>
+              <w:pStyle w:val="Compact"/>
+            </w:pPr>
+            <w:r>
+              <w:t xml:space="preserve">Cost of Sales without stock; each ledger’s own currency (migration 0022) and</w:t>
+            </w:r>
+            <w:r>
+              <w:t xml:space="preserve"> </w:t>
+            </w:r>
+            <w:r>
+              <w:rPr>
+                <w:rStyle w:val="VerbatimChar"/>
+              </w:rPr>
+              <w:t xml:space="preserve">validate currencies</w:t>
+            </w:r>
+            <w:r>
+              <w:t xml:space="preserve">; LB-VAL-028 not raised by a rebuild’s own validation</w:t>
+            </w:r>
+          </w:p>
+        </w:tc>
+        <w:tc>
+          <w:tcPr/>
+          <w:p>
+            <w:pPr>
+              <w:pStyle w:val="Compact"/>
+            </w:pPr>
+            <w:r>
+              <w:t xml:space="preserve">Six-company pilot: four companies’ Profit &amp; Loss lost Cost of Sales where stock was zero; every ledger was INR.</w:t>
+            </w:r>
+          </w:p>
+        </w:tc>
+      </w:tr>
+      <w:tr>
+        <w:tc>
+          <w:tcPr/>
+          <w:p>
+            <w:pPr>
+              <w:pStyle w:val="Compact"/>
+            </w:pPr>
+            <w:r>
+              <w:t xml:space="preserve">#57</w:t>
             </w:r>
           </w:p>
         </w:tc>

</xml_diff>

<commit_message>
VAL-005: voucher counts match the source's voucher type names by the name rules (LB-VAL-036)
Six-company pilot: after the statement fix every company failed the voucher count check.
Each company's custom type under Credit Note is named with two spaces in a row; the stored
vouchers carry the name exactly, but the source's counts no longer matched it, so all its
vouchers were counted as another type's (net difference 0 every month). The count check now
matches the source's names to ours by core/names.py, as the transform does, and notes names
matched only after normalisation, or close but unmatched, with the kinds of difference only.

Co-Authored-By: Claude Opus 5.5 <noreply@anthropic.com>
</commit_message>
<xml_diff>
--- a/docs/export/project-history.docx
+++ b/docs/export/project-history.docx
@@ -2642,7 +2642,53 @@
               <w:pStyle w:val="Compact"/>
             </w:pPr>
             <w:r>
-              <w:t xml:space="preserve">fix/cost-of-sales-and-ledger-currency</w:t>
+              <w:t xml:space="preserve">#57</w:t>
+            </w:r>
+          </w:p>
+        </w:tc>
+        <w:tc>
+          <w:tcPr/>
+          <w:p>
+            <w:pPr>
+              <w:pStyle w:val="Compact"/>
+            </w:pPr>
+            <w:r>
+              <w:t xml:space="preserve">2026-10-29</w:t>
+            </w:r>
+          </w:p>
+        </w:tc>
+        <w:tc>
+          <w:tcPr/>
+          <w:p>
+            <w:pPr>
+              <w:pStyle w:val="Compact"/>
+            </w:pPr>
+            <w:r>
+              <w:t xml:space="preserve">Monthly sales views over the source’s own Sales Accounts group, a ready-to-run pivot, and their proof against Tally’s Sales Accounts line between the stored statement dates (RPT-013, ADR-047)</w:t>
+            </w:r>
+          </w:p>
+        </w:tc>
+        <w:tc>
+          <w:tcPr/>
+          <w:p>
+            <w:pPr>
+              <w:pStyle w:val="Compact"/>
+            </w:pPr>
+            <w:r>
+              <w:t xml:space="preserve">Accountants built the report by hand and missed debit notes and journals posting to sales ledgers.</w:t>
+            </w:r>
+          </w:p>
+        </w:tc>
+      </w:tr>
+      <w:tr>
+        <w:tc>
+          <w:tcPr/>
+          <w:p>
+            <w:pPr>
+              <w:pStyle w:val="Compact"/>
+            </w:pPr>
+            <w:r>
+              <w:t xml:space="preserve">#58</w:t>
             </w:r>
           </w:p>
         </w:tc>
@@ -2700,40 +2746,40 @@
               <w:pStyle w:val="Compact"/>
             </w:pPr>
             <w:r>
-              <w:t xml:space="preserve">#57</w:t>
-            </w:r>
-          </w:p>
-        </w:tc>
-        <w:tc>
-          <w:tcPr/>
-          <w:p>
-            <w:pPr>
-              <w:pStyle w:val="Compact"/>
-            </w:pPr>
-            <w:r>
-              <w:t xml:space="preserve">2026-10-29</w:t>
-            </w:r>
-          </w:p>
-        </w:tc>
-        <w:tc>
-          <w:tcPr/>
-          <w:p>
-            <w:pPr>
-              <w:pStyle w:val="Compact"/>
-            </w:pPr>
-            <w:r>
-              <w:t xml:space="preserve">Monthly sales views over the source’s own Sales Accounts group, a ready-to-run pivot, and their proof against Tally’s Sales Accounts line between the stored statement dates (RPT-013, ADR-047)</w:t>
-            </w:r>
-          </w:p>
-        </w:tc>
-        <w:tc>
-          <w:tcPr/>
-          <w:p>
-            <w:pPr>
-              <w:pStyle w:val="Compact"/>
-            </w:pPr>
-            <w:r>
-              <w:t xml:space="preserve">Accountants built the report by hand and missed debit notes and journals posting to sales ledgers.</w:t>
+              <w:t xml:space="preserve">fix/voucher-type-names-in-counts</w:t>
+            </w:r>
+          </w:p>
+        </w:tc>
+        <w:tc>
+          <w:tcPr/>
+          <w:p>
+            <w:pPr>
+              <w:pStyle w:val="Compact"/>
+            </w:pPr>
+            <w:r>
+              <w:t xml:space="preserve">2026-10-30</w:t>
+            </w:r>
+          </w:p>
+        </w:tc>
+        <w:tc>
+          <w:tcPr/>
+          <w:p>
+            <w:pPr>
+              <w:pStyle w:val="Compact"/>
+            </w:pPr>
+            <w:r>
+              <w:t xml:space="preserve">Voucher counts match the source’s voucher type names by the name rules (LB-VAL-036)</w:t>
+            </w:r>
+          </w:p>
+        </w:tc>
+        <w:tc>
+          <w:tcPr/>
+          <w:p>
+            <w:pPr>
+              <w:pStyle w:val="Compact"/>
+            </w:pPr>
+            <w:r>
+              <w:t xml:space="preserve">Six-company pilot: after the statement fix every company failed the voucher count check: Tally’s counts wrote one Credit Note type’s name with one space where it has two.</w:t>
             </w:r>
           </w:p>
         </w:tc>

</xml_diff>

<commit_message>
VAL-005: voucher counts match the source's voucher type names by the name rules (LB-VAL-036) (#59)
Six-company pilot: after the statement fix every company failed the voucher count check.
Each company's custom type under Credit Note is named with two spaces in a row; the stored
vouchers carry the name exactly, but the source's counts no longer matched it, so all its
vouchers were counted as another type's (net difference 0 every month). The count check now
matches the source's names to ours by core/names.py, as the transform does, and notes names
matched only after normalisation, or close but unmatched, with the kinds of difference only.

Co-authored-by: Claude Opus 5.5 <noreply@anthropic.com>
</commit_message>
<xml_diff>
--- a/docs/export/project-history.docx
+++ b/docs/export/project-history.docx
@@ -2642,7 +2642,53 @@
               <w:pStyle w:val="Compact"/>
             </w:pPr>
             <w:r>
-              <w:t xml:space="preserve">fix/cost-of-sales-and-ledger-currency</w:t>
+              <w:t xml:space="preserve">#57</w:t>
+            </w:r>
+          </w:p>
+        </w:tc>
+        <w:tc>
+          <w:tcPr/>
+          <w:p>
+            <w:pPr>
+              <w:pStyle w:val="Compact"/>
+            </w:pPr>
+            <w:r>
+              <w:t xml:space="preserve">2026-10-29</w:t>
+            </w:r>
+          </w:p>
+        </w:tc>
+        <w:tc>
+          <w:tcPr/>
+          <w:p>
+            <w:pPr>
+              <w:pStyle w:val="Compact"/>
+            </w:pPr>
+            <w:r>
+              <w:t xml:space="preserve">Monthly sales views over the source’s own Sales Accounts group, a ready-to-run pivot, and their proof against Tally’s Sales Accounts line between the stored statement dates (RPT-013, ADR-047)</w:t>
+            </w:r>
+          </w:p>
+        </w:tc>
+        <w:tc>
+          <w:tcPr/>
+          <w:p>
+            <w:pPr>
+              <w:pStyle w:val="Compact"/>
+            </w:pPr>
+            <w:r>
+              <w:t xml:space="preserve">Accountants built the report by hand and missed debit notes and journals posting to sales ledgers.</w:t>
+            </w:r>
+          </w:p>
+        </w:tc>
+      </w:tr>
+      <w:tr>
+        <w:tc>
+          <w:tcPr/>
+          <w:p>
+            <w:pPr>
+              <w:pStyle w:val="Compact"/>
+            </w:pPr>
+            <w:r>
+              <w:t xml:space="preserve">#58</w:t>
             </w:r>
           </w:p>
         </w:tc>
@@ -2700,40 +2746,40 @@
               <w:pStyle w:val="Compact"/>
             </w:pPr>
             <w:r>
-              <w:t xml:space="preserve">#57</w:t>
-            </w:r>
-          </w:p>
-        </w:tc>
-        <w:tc>
-          <w:tcPr/>
-          <w:p>
-            <w:pPr>
-              <w:pStyle w:val="Compact"/>
-            </w:pPr>
-            <w:r>
-              <w:t xml:space="preserve">2026-10-29</w:t>
-            </w:r>
-          </w:p>
-        </w:tc>
-        <w:tc>
-          <w:tcPr/>
-          <w:p>
-            <w:pPr>
-              <w:pStyle w:val="Compact"/>
-            </w:pPr>
-            <w:r>
-              <w:t xml:space="preserve">Monthly sales views over the source’s own Sales Accounts group, a ready-to-run pivot, and their proof against Tally’s Sales Accounts line between the stored statement dates (RPT-013, ADR-047)</w:t>
-            </w:r>
-          </w:p>
-        </w:tc>
-        <w:tc>
-          <w:tcPr/>
-          <w:p>
-            <w:pPr>
-              <w:pStyle w:val="Compact"/>
-            </w:pPr>
-            <w:r>
-              <w:t xml:space="preserve">Accountants built the report by hand and missed debit notes and journals posting to sales ledgers.</w:t>
+              <w:t xml:space="preserve">fix/voucher-type-names-in-counts</w:t>
+            </w:r>
+          </w:p>
+        </w:tc>
+        <w:tc>
+          <w:tcPr/>
+          <w:p>
+            <w:pPr>
+              <w:pStyle w:val="Compact"/>
+            </w:pPr>
+            <w:r>
+              <w:t xml:space="preserve">2026-10-30</w:t>
+            </w:r>
+          </w:p>
+        </w:tc>
+        <w:tc>
+          <w:tcPr/>
+          <w:p>
+            <w:pPr>
+              <w:pStyle w:val="Compact"/>
+            </w:pPr>
+            <w:r>
+              <w:t xml:space="preserve">Voucher counts match the source’s voucher type names by the name rules (LB-VAL-036)</w:t>
+            </w:r>
+          </w:p>
+        </w:tc>
+        <w:tc>
+          <w:tcPr/>
+          <w:p>
+            <w:pPr>
+              <w:pStyle w:val="Compact"/>
+            </w:pPr>
+            <w:r>
+              <w:t xml:space="preserve">Six-company pilot: after the statement fix every company failed the voucher count check: Tally’s counts wrote one Credit Note type’s name with one space where it has two.</w:t>
             </w:r>
           </w:p>
         </w:tc>

</xml_diff>

<commit_message>
SYN-007: entities on hold (migration 0023, ./dev.ps1 on-hold)
An entity on hold is skipped by sync, the deletion check, validate (and its database-only
checks) and statements unless it is named with -Company; the source isn't asked about it, so
it needn't be loaded. The health report lists it under "On hold", outside the overall
verdict. `./dev.ps1 on-hold [set|clear -EntityId <id>]` sets, clears and lists; every change
is written to the audit log (AUD-001).

Co-Authored-By: Claude Opus 5.5 <noreply@anthropic.com>
</commit_message>
<xml_diff>
--- a/docs/export/project-history.docx
+++ b/docs/export/project-history.docx
@@ -2746,7 +2746,7 @@
               <w:pStyle w:val="Compact"/>
             </w:pPr>
             <w:r>
-              <w:t xml:space="preserve">fix/voucher-type-names-in-counts</w:t>
+              <w:t xml:space="preserve">#59</w:t>
             </w:r>
           </w:p>
         </w:tc>
@@ -2780,6 +2780,67 @@
             </w:pPr>
             <w:r>
               <w:t xml:space="preserve">Six-company pilot: after the statement fix every company failed the voucher count check: Tally’s counts wrote one Credit Note type’s name with one space where it has two.</w:t>
+            </w:r>
+          </w:p>
+        </w:tc>
+      </w:tr>
+      <w:tr>
+        <w:tc>
+          <w:tcPr/>
+          <w:p>
+            <w:pPr>
+              <w:pStyle w:val="Compact"/>
+            </w:pPr>
+            <w:r>
+              <w:t xml:space="preserve">fix/entity-on-hold</w:t>
+            </w:r>
+          </w:p>
+        </w:tc>
+        <w:tc>
+          <w:tcPr/>
+          <w:p>
+            <w:pPr>
+              <w:pStyle w:val="Compact"/>
+            </w:pPr>
+            <w:r>
+              <w:t xml:space="preserve">2026-10-30</w:t>
+            </w:r>
+          </w:p>
+        </w:tc>
+        <w:tc>
+          <w:tcPr/>
+          <w:p>
+            <w:pPr>
+              <w:pStyle w:val="Compact"/>
+            </w:pPr>
+            <w:r>
+              <w:t xml:space="preserve">Entities on hold (SYN-007, migration 0023): skipped by sync, validate and statements unless named, listed outside the report’s verdict;</w:t>
+            </w:r>
+            <w:r>
+              <w:t xml:space="preserve"> </w:t>
+            </w:r>
+            <w:r>
+              <w:rPr>
+                <w:rStyle w:val="VerbatimChar"/>
+              </w:rPr>
+              <w:t xml:space="preserve">./dev.ps1 on-hold</w:t>
+            </w:r>
+            <w:r>
+              <w:t xml:space="preserve"> </w:t>
+            </w:r>
+            <w:r>
+              <w:t xml:space="preserve">(audited)</w:t>
+            </w:r>
+          </w:p>
+        </w:tc>
+        <w:tc>
+          <w:tcPr/>
+          <w:p>
+            <w:pPr>
+              <w:pStyle w:val="Compact"/>
+            </w:pPr>
+            <w:r>
+              <w:t xml:space="preserve">Six-company pilot: the seventh company, on hold and not loaded in Tally, stopped commands over all companies and kept the verdict at FAILED.</w:t>
             </w:r>
           </w:p>
         </w:tc>

</xml_diff>

<commit_message>
SYN-007: entities on hold (migration 0023, ./dev.ps1 on-hold) (#60)
* SYN-007: entities on hold (migration 0023, ./dev.ps1 on-hold)

An entity on hold is skipped by sync, the deletion check, validate (and its database-only
checks) and statements unless it is named with -Company; the source isn't asked about it, so
it needn't be loaded. The health report lists it under "On hold", outside the overall
verdict. `./dev.ps1 on-hold [set|clear -EntityId <id>]` sets, clears and lists; every change
is written to the audit log (AUD-001).

Co-Authored-By: Claude Opus 5.5 <noreply@anthropic.com>

* SYN-007: a sync with every company on hold says 'none'

Co-Authored-By: Claude Opus 5.5 <noreply@anthropic.com>

---------

Co-authored-by: Claude Opus 5.5 <noreply@anthropic.com>
</commit_message>
<xml_diff>
--- a/docs/export/project-history.docx
+++ b/docs/export/project-history.docx
@@ -2746,7 +2746,7 @@
               <w:pStyle w:val="Compact"/>
             </w:pPr>
             <w:r>
-              <w:t xml:space="preserve">fix/voucher-type-names-in-counts</w:t>
+              <w:t xml:space="preserve">#59</w:t>
             </w:r>
           </w:p>
         </w:tc>
@@ -2780,6 +2780,67 @@
             </w:pPr>
             <w:r>
               <w:t xml:space="preserve">Six-company pilot: after the statement fix every company failed the voucher count check: Tally’s counts wrote one Credit Note type’s name with one space where it has two.</w:t>
+            </w:r>
+          </w:p>
+        </w:tc>
+      </w:tr>
+      <w:tr>
+        <w:tc>
+          <w:tcPr/>
+          <w:p>
+            <w:pPr>
+              <w:pStyle w:val="Compact"/>
+            </w:pPr>
+            <w:r>
+              <w:t xml:space="preserve">fix/entity-on-hold</w:t>
+            </w:r>
+          </w:p>
+        </w:tc>
+        <w:tc>
+          <w:tcPr/>
+          <w:p>
+            <w:pPr>
+              <w:pStyle w:val="Compact"/>
+            </w:pPr>
+            <w:r>
+              <w:t xml:space="preserve">2026-10-30</w:t>
+            </w:r>
+          </w:p>
+        </w:tc>
+        <w:tc>
+          <w:tcPr/>
+          <w:p>
+            <w:pPr>
+              <w:pStyle w:val="Compact"/>
+            </w:pPr>
+            <w:r>
+              <w:t xml:space="preserve">Entities on hold (SYN-007, migration 0023): skipped by sync, validate and statements unless named, listed outside the report’s verdict;</w:t>
+            </w:r>
+            <w:r>
+              <w:t xml:space="preserve"> </w:t>
+            </w:r>
+            <w:r>
+              <w:rPr>
+                <w:rStyle w:val="VerbatimChar"/>
+              </w:rPr>
+              <w:t xml:space="preserve">./dev.ps1 on-hold</w:t>
+            </w:r>
+            <w:r>
+              <w:t xml:space="preserve"> </w:t>
+            </w:r>
+            <w:r>
+              <w:t xml:space="preserve">(audited)</w:t>
+            </w:r>
+          </w:p>
+        </w:tc>
+        <w:tc>
+          <w:tcPr/>
+          <w:p>
+            <w:pPr>
+              <w:pStyle w:val="Compact"/>
+            </w:pPr>
+            <w:r>
+              <w:t xml:space="preserve">Six-company pilot: the seventh company, on hold and not loaded in Tally, stopped commands over all companies and kept the verdict at FAILED.</w:t>
             </w:r>
           </w:p>
         </w:tc>

</xml_diff>